<commit_message>
Move position farther from center and compare with friend
Co-Authored-By: Claude Opus 5.5 <noreply@anthropic.com>
Claude-Session: https://claude.ai/code/session_012cugsJEu6jJtj4GmQFpvdM
</commit_message>
<xml_diff>
--- a/ubicacion_social.docx
+++ b/ubicacion_social.docx
@@ -12,17 +12,17 @@
     </w:p>
     <w:p>
       <w:r>
-        <w:t>Soy hombre, tengo 21 años, soy de clase media alta, no tengo religión y estudio en el ITESO, que es una universidad privada. Rento un departamento atrás del ITESO y llego en carro, así que no tengo que hacer trayectos largos ni depender del transporte público como muchos de mis compañeros. Todo esto me pone en un lugar bastante privilegiado dentro de la sociedad.</w:t>
+        <w:t>Soy hombre, tengo 21 años, soy de clase media alta, no tengo religión y estudio en el ITESO, que es una universidad privada. Rento un departamento atrás del ITESO y llego en carro, así que no tengo que hacer trayectos largos ni depender del transporte público. En ese sentido sí tengo algunas ventajas.</w:t>
       </w:r>
     </w:p>
     <w:p>
       <w:r>
-        <w:t>Creo que estoy relativamente cerca de los centros de poder, aunque no dentro de ellos. Ser hombre, estudiar en una universidad privada y no tener que preocuparme por cosas básicas como el transporte o la vivienda me da ventajas que muchos jóvenes en México no tienen. Lo que más me aleja del centro es que todavía no tengo dinero propio, ya que dependo de mi familia para la renta y mis gastos, así que muchas de mis decisiones todavía dependen de ellos.</w:t>
+        <w:t>Aun así, siento que estoy bastante lejos de los centros de poder. No tengo dinero propio, dependo de mi familia para la renta y mis gastos, y no tengo influencia real en las decisiones importantes de la sociedad, como las que toman el gobierno o los grandes empresarios. Por eso me ubico en medio de la clase media, con algunas ventajas pero muy lejos de donde realmente se decide cómo funcionan las cosas.</w:t>
       </w:r>
     </w:p>
     <w:p>
       <w:r>
-        <w:t>Si me comparo con un chavo promedio de mi edad, la diferencia es clara. Probablemente él tiene que trabajar mientras estudia o ni siquiera tiene la oportunidad de estudiar, se mueve en camión y vive lejos de su escuela o su trabajo. En el mapa él estaría más lejos del centro que yo, y no por algo que haya hecho, sino por su ubicación social. Esto me hace ver que muchas de las ventajas que tengo no las gané yo, sino que vienen del lugar donde me tocó estar.</w:t>
+        <w:t>Si me comparo con mi amiga que viene desde Zapotlanejo, ella estaría un poco más abajo que yo, aunque no mucho. Las dos personas estudiamos en la misma universidad, pero ella tiene que hacer un trayecto mucho más largo todos los días, lo que significa más tiempo y más dinero solo para poder llegar a clases. Algo tan simple como vivir cerca o lejos de la escuela ya marca una diferencia en las oportunidades y el tiempo que cada quien tiene, y eso es parte de la ubicación social.</w:t>
       </w:r>
     </w:p>
     <w:p>

</xml_diff>